<commit_message>
update frontend of equipment system adding clients files as a step in a simple project
</commit_message>
<xml_diff>
--- a/public/files/mv-word-template.docx
+++ b/public/files/mv-word-template.docx
@@ -164,7 +164,7 @@
                                   <w:tblDescription w:val="Cover page layout"/>
                                 </w:tblPr>
                                 <w:tblGrid>
-                                  <w:gridCol w:w="11875"/>
+                                  <w:gridCol w:w="11860"/>
                                 </w:tblGrid>
                                 <w:tr>
                                   <w:trPr>
@@ -264,9 +264,9 @@
                                         <w:tblDescription w:val="Cover page info"/>
                                       </w:tblPr>
                                       <w:tblGrid>
-                                        <w:gridCol w:w="3959"/>
-                                        <w:gridCol w:w="3760"/>
-                                        <w:gridCol w:w="4156"/>
+                                        <w:gridCol w:w="3953"/>
+                                        <w:gridCol w:w="3756"/>
+                                        <w:gridCol w:w="4151"/>
                                       </w:tblGrid>
                                       <w:tr>
                                         <w:trPr>
@@ -587,7 +587,7 @@
                             <w:tblDescription w:val="Cover page layout"/>
                           </w:tblPr>
                           <w:tblGrid>
-                            <w:gridCol w:w="11875"/>
+                            <w:gridCol w:w="11860"/>
                           </w:tblGrid>
                           <w:tr>
                             <w:trPr>
@@ -687,9 +687,9 @@
                                   <w:tblDescription w:val="Cover page info"/>
                                 </w:tblPr>
                                 <w:tblGrid>
-                                  <w:gridCol w:w="3959"/>
-                                  <w:gridCol w:w="3760"/>
-                                  <w:gridCol w:w="4156"/>
+                                  <w:gridCol w:w="3953"/>
+                                  <w:gridCol w:w="3756"/>
+                                  <w:gridCol w:w="4151"/>
                                 </w:tblGrid>
                                 <w:tr>
                                   <w:trPr>
@@ -11186,16 +11186,19 @@
       <w:pPr>
         <w:bidi/>
         <w:rPr>
-          <w:rFonts w:ascii="Tajawal" w:hAnsi="Tajawal" w:cs="Tajawal"/>
-          <w:rtl/>
-          <w:lang w:val="en-US"/>
-        </w:rPr>
-      </w:pPr>
+          <w:rFonts w:ascii="Tajawal" w:hAnsi="Tajawal" w:cs="Tajawal" w:hint="cs"/>
+          <w:rtl/>
+          <w:lang w:val="en-US"/>
+        </w:rPr>
+      </w:pPr>
+      <w:bookmarkStart w:id="58" w:name="مستنداتعميل"/>
+      <w:bookmarkEnd w:id="58"/>
     </w:p>
     <w:tbl>
       <w:tblPr>
         <w:bidiVisual/>
         <w:tblW w:w="0" w:type="auto"/>
+        <w:tblLayout w:type="fixed"/>
         <w:tblCellMar>
           <w:left w:w="0" w:type="dxa"/>
           <w:right w:w="0" w:type="dxa"/>
@@ -11203,8 +11206,8 @@
         <w:tblLook w:val="0000" w:firstRow="0" w:lastRow="0" w:firstColumn="0" w:lastColumn="0" w:noHBand="0" w:noVBand="0"/>
       </w:tblPr>
       <w:tblGrid>
-        <w:gridCol w:w="6"/>
-        <w:gridCol w:w="6"/>
+        <w:gridCol w:w="20"/>
+        <w:gridCol w:w="20"/>
       </w:tblGrid>
       <w:tr>
         <w:trPr>
@@ -11212,7 +11215,7 @@
         </w:trPr>
         <w:tc>
           <w:tcPr>
-            <w:tcW w:w="0" w:type="auto"/>
+            <w:tcW w:w="6" w:type="dxa"/>
           </w:tcPr>
           <w:p>
             <w:pPr>
@@ -11226,7 +11229,7 @@
         </w:tc>
         <w:tc>
           <w:tcPr>
-            <w:tcW w:w="0" w:type="auto"/>
+            <w:tcW w:w="20" w:type="dxa"/>
           </w:tcPr>
           <w:p>
             <w:pPr>
@@ -11234,6 +11237,7 @@
               <w:rPr>
                 <w:rFonts w:ascii="Tajawal" w:hAnsi="Tajawal" w:cs="Tajawal"/>
                 <w:rtl/>
+                <w:lang w:val="en-US"/>
               </w:rPr>
             </w:pPr>
           </w:p>
@@ -11252,8 +11256,8 @@
           <w:headerReference w:type="default" r:id="rId27"/>
           <w:headerReference w:type="first" r:id="rId28"/>
           <w:footerReference w:type="first" r:id="rId29"/>
-          <w:pgSz w:w="16838" w:h="11906" w:orient="landscape"/>
-          <w:pgMar w:top="1440" w:right="2126" w:bottom="386" w:left="357" w:header="709" w:footer="709" w:gutter="0"/>
+          <w:pgSz w:w="11906" w:h="16838"/>
+          <w:pgMar w:top="2126" w:right="386" w:bottom="357" w:left="1440" w:header="709" w:footer="709" w:gutter="0"/>
           <w:cols w:space="708"/>
           <w:titlePg/>
           <w:docGrid w:linePitch="360"/>
@@ -11294,7 +11298,7 @@
           <w:docGrid w:linePitch="360"/>
         </w:sectPr>
       </w:pPr>
-      <w:bookmarkStart w:id="58" w:name="_Toc215478394"/>
+      <w:bookmarkStart w:id="59" w:name="_Toc215478394"/>
       <w:r>
         <w:rPr>
           <w:rFonts w:ascii="Tajawal" w:hAnsi="Tajawal" w:cs="Tajawal"/>
@@ -11319,7 +11323,7 @@
         </w:rPr>
         <w:t>: شهادة التسجيل في بوابة الخدمات الإلكترونية للهيئة السعودية للمقيمين المعتمدين "تقييم"</w:t>
       </w:r>
-      <w:bookmarkEnd w:id="58"/>
+      <w:bookmarkEnd w:id="59"/>
     </w:p>
     <w:p>
       <w:pPr>

</xml_diff>